<commit_message>
fix(em): auto-calculate date initiated and date of incident based on incubation schedule and ETX date
</commit_message>
<xml_diff>
--- a/EM OOS P1 template 0.docx
+++ b/EM OOS P1 template 0.docx
@@ -311,35 +311,9 @@
             <w:gridSpan w:val="2"/>
           </w:tcPr>
           <w:p>
-            <w:pPr>
-              <w:outlineLvl w:val="0"/>
-              <w:rPr>
-                <w:rFonts w:ascii="Times New Roman" w:hAnsi="Times New Roman"/>
-                <w:bCs/>
-                <w:sz w:val="22"/>
-                <w:szCs w:val="22"/>
-              </w:rPr>
-            </w:pPr>
-            <w:r>
-              <w:rPr>
-                <w:rFonts w:ascii="Times New Roman" w:hAnsi="Times New Roman"/>
-                <w:bCs/>
-                <w:sz w:val="22"/>
-                <w:szCs w:val="22"/>
-              </w:rPr>
-              <w:t>{{ test_date }}</w:t>
-            </w:r>
-          </w:p>
-          <w:p>
-            <w:pPr>
-              <w:outlineLvl w:val="0"/>
-              <w:rPr>
-                <w:rFonts w:ascii="Times New Roman" w:hAnsi="Times New Roman"/>
-                <w:bCs/>
-                <w:sz w:val="22"/>
-                <w:szCs w:val="22"/>
-              </w:rPr>
-            </w:pPr>
+            <w:r>
+              <w:t>{{ date_initiated }}</w:t>
+            </w:r>
           </w:p>
         </w:tc>
       </w:tr>
@@ -378,35 +352,9 @@
             <w:tcW w:w="2503" w:type="dxa"/>
           </w:tcPr>
           <w:p>
-            <w:pPr>
-              <w:outlineLvl w:val="0"/>
-              <w:rPr>
-                <w:rFonts w:ascii="Times New Roman" w:hAnsi="Times New Roman"/>
-                <w:bCs/>
-                <w:sz w:val="22"/>
-                <w:szCs w:val="22"/>
-              </w:rPr>
-            </w:pPr>
-            <w:r>
-              <w:rPr>
-                <w:rFonts w:ascii="Times New Roman" w:hAnsi="Times New Roman"/>
-                <w:bCs/>
-                <w:sz w:val="22"/>
-                <w:szCs w:val="22"/>
-              </w:rPr>
-              <w:t>{{ test_date }}</w:t>
-            </w:r>
-          </w:p>
-          <w:p>
-            <w:pPr>
-              <w:outlineLvl w:val="0"/>
-              <w:rPr>
-                <w:rFonts w:ascii="Times New Roman" w:hAnsi="Times New Roman"/>
-                <w:bCs/>
-                <w:sz w:val="22"/>
-                <w:szCs w:val="22"/>
-              </w:rPr>
-            </w:pPr>
+            <w:r>
+              <w:t>{{ date_of_incident }}</w:t>
+            </w:r>
           </w:p>
         </w:tc>
         <w:tc>
@@ -1945,55 +1893,12 @@
             <w:gridSpan w:val="5"/>
           </w:tcPr>
           <w:p>
-            <w:pPr>
-              <w:outlineLvl w:val="0"/>
-              <w:rPr>
-                <w:rFonts w:ascii="Times New Roman" w:hAnsi="Times New Roman"/>
-                <w:bCs/>
-                <w:sz w:val="22"/>
-                <w:szCs w:val="22"/>
-              </w:rPr>
-            </w:pPr>
-            <w:r>
-              <w:rPr>
-                <w:rFonts w:ascii="Times New Roman" w:hAnsi="Times New Roman"/>
-                <w:bCs/>
-                <w:sz w:val="22"/>
-                <w:szCs w:val="22"/>
-              </w:rPr>
+            <w:r>
               <w:t>Date:</w:t>
-            </w:r>
-          </w:p>
-          <w:p>
-            <w:pPr>
-              <w:outlineLvl w:val="0"/>
-              <w:rPr>
-                <w:rFonts w:ascii="Times New Roman" w:hAnsi="Times New Roman"/>
-                <w:bCs/>
-                <w:sz w:val="22"/>
-                <w:szCs w:val="22"/>
-              </w:rPr>
-            </w:pPr>
-            <w:r>
-              <w:rPr>
-                <w:rFonts w:ascii="Times New Roman" w:hAnsi="Times New Roman"/>
-                <w:bCs/>
-                <w:sz w:val="22"/>
-                <w:szCs w:val="22"/>
-              </w:rPr>
-              <w:t>{{ test_date }}</w:t>
-            </w:r>
-          </w:p>
-          <w:p>
-            <w:pPr>
-              <w:outlineLvl w:val="0"/>
-              <w:rPr>
-                <w:rFonts w:ascii="Times New Roman" w:hAnsi="Times New Roman"/>
-                <w:bCs/>
-                <w:sz w:val="22"/>
-                <w:szCs w:val="22"/>
-              </w:rPr>
-            </w:pPr>
+              <w:br/>
+              <w:t>{{ date_initiated }}</w:t>
+              <w:br/>
+            </w:r>
           </w:p>
         </w:tc>
         <w:tc>

</xml_diff>

<commit_message>
fix(em): uncheck Client Care checkboxes in Word and PDF templates for internal EM OOS
</commit_message>
<xml_diff>
--- a/EM OOS P1 template 0.docx
+++ b/EM OOS P1 template 0.docx
@@ -1373,7 +1373,7 @@
                   <w:calcOnExit w:val="0"/>
                   <w:checkBox>
                     <w:sizeAuto/>
-                    <w:default w:val="1"/>
+                    <w:default w:val="0"/>
                   </w:checkBox>
                 </w:ffData>
               </w:fldChar>
@@ -1458,7 +1458,7 @@
                   <w:calcOnExit w:val="0"/>
                   <w:checkBox>
                     <w:sizeAuto/>
-                    <w:default w:val="1"/>
+                    <w:default w:val="0"/>
                   </w:checkBox>
                 </w:ffData>
               </w:fldChar>

</xml_diff>

<commit_message>
fix(em): set Correct samples analyzed? checkbox to N/A instead of Yes in docx and pdf templates
</commit_message>
<xml_diff>
--- a/EM OOS P1 template 0.docx
+++ b/EM OOS P1 template 0.docx
@@ -2587,7 +2587,7 @@
                   <w:calcOnExit w:val="0"/>
                   <w:checkBox>
                     <w:sizeAuto/>
-                    <w:default w:val="1"/>
+                    <w:default w:val="0"/>
                   </w:checkBox>
                 </w:ffData>
               </w:fldChar>
@@ -2711,7 +2711,7 @@
                   <w:calcOnExit w:val="0"/>
                   <w:checkBox>
                     <w:sizeAuto/>
-                    <w:default w:val="0"/>
+                    <w:default w:val="1"/>
                   </w:checkBox>
                 </w:ffData>
               </w:fldChar>

</xml_diff>

<commit_message>
fix(em): set Material Discrepancy and Sample Integrity checkboxes to N/A for EM OOS
</commit_message>
<xml_diff>
--- a/EM OOS P1 template 0.docx
+++ b/EM OOS P1 template 0.docx
@@ -4836,6 +4836,72 @@
                   <w:calcOnExit w:val="0"/>
                   <w:checkBox>
                     <w:sizeAuto/>
+                    <w:default w:val="0"/>
+                  </w:checkBox>
+                </w:ffData>
+              </w:fldChar>
+            </w:r>
+            <w:r>
+              <w:rPr>
+                <w:rFonts w:ascii="Times New Roman" w:hAnsi="Times New Roman"/>
+                <w:sz w:val="22"/>
+                <w:szCs w:val="22"/>
+              </w:rPr>
+              <w:instrText xml:space="preserve"> FORMCHECKBOX </w:instrText>
+            </w:r>
+            <w:r>
+              <w:rPr>
+                <w:rFonts w:ascii="Times New Roman" w:hAnsi="Times New Roman"/>
+                <w:sz w:val="22"/>
+                <w:szCs w:val="22"/>
+              </w:rPr>
+            </w:r>
+            <w:r>
+              <w:rPr>
+                <w:rFonts w:ascii="Times New Roman" w:hAnsi="Times New Roman"/>
+                <w:sz w:val="22"/>
+                <w:szCs w:val="22"/>
+              </w:rPr>
+              <w:fldChar w:fldCharType="separate"/>
+            </w:r>
+            <w:r>
+              <w:rPr>
+                <w:rFonts w:ascii="Times New Roman" w:hAnsi="Times New Roman"/>
+                <w:sz w:val="22"/>
+                <w:szCs w:val="22"/>
+              </w:rPr>
+              <w:fldChar w:fldCharType="end"/>
+            </w:r>
+            <w:r>
+              <w:rPr>
+                <w:rFonts w:ascii="Times New Roman" w:hAnsi="Times New Roman"/>
+                <w:sz w:val="22"/>
+                <w:szCs w:val="22"/>
+              </w:rPr>
+              <w:t xml:space="preserve"> </w:t>
+            </w:r>
+            <w:r>
+              <w:rPr>
+                <w:rFonts w:ascii="Times New Roman" w:hAnsi="Times New Roman"/>
+                <w:noProof/>
+                <w:sz w:val="22"/>
+                <w:szCs w:val="22"/>
+              </w:rPr>
+              <w:t xml:space="preserve">No   </w:t>
+            </w:r>
+            <w:r>
+              <w:rPr>
+                <w:rFonts w:ascii="Times New Roman" w:hAnsi="Times New Roman"/>
+                <w:sz w:val="22"/>
+                <w:szCs w:val="22"/>
+              </w:rPr>
+              <w:fldChar w:fldCharType="begin">
+                <w:ffData>
+                  <w:name w:val="Check1"/>
+                  <w:enabled/>
+                  <w:calcOnExit w:val="0"/>
+                  <w:checkBox>
+                    <w:sizeAuto/>
                     <w:default w:val="1"/>
                   </w:checkBox>
                 </w:ffData>
@@ -4878,7 +4944,142 @@
                 <w:sz w:val="22"/>
                 <w:szCs w:val="22"/>
               </w:rPr>
-              <w:t xml:space="preserve"> </w:t>
+              <w:t>N/A</w:t>
+            </w:r>
+          </w:p>
+        </w:tc>
+        <w:tc>
+          <w:tcPr>
+            <w:tcW w:w="2352" w:type="dxa"/>
+            <w:gridSpan w:val="5"/>
+            <w:shd w:val="clear" w:color="auto" w:fill="000000" w:themeFill="text1"/>
+          </w:tcPr>
+          <w:p>
+            <w:pPr>
+              <w:jc w:val="center"/>
+              <w:outlineLvl w:val="0"/>
+              <w:rPr>
+                <w:rFonts w:ascii="Times New Roman" w:hAnsi="Times New Roman"/>
+                <w:b/>
+                <w:color w:val="0D0D0D" w:themeColor="text1" w:themeTint="F2"/>
+                <w:sz w:val="22"/>
+                <w:szCs w:val="22"/>
+              </w:rPr>
+            </w:pPr>
+          </w:p>
+        </w:tc>
+        <w:tc>
+          <w:tcPr>
+            <w:tcW w:w="1800" w:type="dxa"/>
+            <w:shd w:val="clear" w:color="auto" w:fill="000000" w:themeFill="text1"/>
+          </w:tcPr>
+          <w:p>
+            <w:pPr>
+              <w:jc w:val="center"/>
+              <w:outlineLvl w:val="0"/>
+              <w:rPr>
+                <w:rFonts w:ascii="Times New Roman" w:hAnsi="Times New Roman"/>
+                <w:b/>
+                <w:color w:val="0D0D0D" w:themeColor="text1" w:themeTint="F2"/>
+                <w:sz w:val="22"/>
+                <w:szCs w:val="22"/>
+              </w:rPr>
+            </w:pPr>
+          </w:p>
+        </w:tc>
+      </w:tr>
+      <w:tr>
+        <w:trPr>
+          <w:trHeight w:val="312"/>
+        </w:trPr>
+        <w:tc>
+          <w:tcPr>
+            <w:tcW w:w="4230" w:type="dxa"/>
+            <w:gridSpan w:val="2"/>
+            <w:shd w:val="clear" w:color="auto" w:fill="FFFFFF" w:themeFill="background1"/>
+          </w:tcPr>
+          <w:p>
+            <w:pPr>
+              <w:outlineLvl w:val="0"/>
+              <w:rPr>
+                <w:rFonts w:ascii="Times New Roman" w:hAnsi="Times New Roman"/>
+                <w:sz w:val="22"/>
+                <w:szCs w:val="22"/>
+              </w:rPr>
+            </w:pPr>
+            <w:r>
+              <w:rPr>
+                <w:rFonts w:ascii="Times New Roman" w:hAnsi="Times New Roman"/>
+                <w:sz w:val="22"/>
+                <w:szCs w:val="22"/>
+              </w:rPr>
+              <w:t>Are the other test results from this run under investigation?</w:t>
+            </w:r>
+          </w:p>
+        </w:tc>
+        <w:tc>
+          <w:tcPr>
+            <w:tcW w:w="2598" w:type="dxa"/>
+            <w:gridSpan w:val="4"/>
+            <w:shd w:val="clear" w:color="auto" w:fill="FFFFFF" w:themeFill="background1"/>
+          </w:tcPr>
+          <w:p>
+            <w:pPr>
+              <w:outlineLvl w:val="0"/>
+              <w:rPr>
+                <w:rFonts w:ascii="Times New Roman" w:hAnsi="Times New Roman"/>
+                <w:sz w:val="22"/>
+                <w:szCs w:val="22"/>
+              </w:rPr>
+            </w:pPr>
+            <w:r>
+              <w:rPr>
+                <w:rFonts w:ascii="Times New Roman" w:hAnsi="Times New Roman"/>
+                <w:sz w:val="22"/>
+                <w:szCs w:val="22"/>
+              </w:rPr>
+              <w:fldChar w:fldCharType="begin">
+                <w:ffData>
+                  <w:name w:val=""/>
+                  <w:enabled/>
+                  <w:calcOnExit w:val="0"/>
+                  <w:checkBox>
+                    <w:sizeAuto/>
+                    <w:default w:val="0"/>
+                  </w:checkBox>
+                </w:ffData>
+              </w:fldChar>
+            </w:r>
+            <w:r>
+              <w:rPr>
+                <w:rFonts w:ascii="Times New Roman" w:hAnsi="Times New Roman"/>
+                <w:sz w:val="22"/>
+                <w:szCs w:val="22"/>
+              </w:rPr>
+              <w:instrText xml:space="preserve"> FORMCHECKBOX </w:instrText>
+            </w:r>
+            <w:r>
+              <w:rPr>
+                <w:rFonts w:ascii="Times New Roman" w:hAnsi="Times New Roman"/>
+                <w:sz w:val="22"/>
+                <w:szCs w:val="22"/>
+              </w:rPr>
+            </w:r>
+            <w:r>
+              <w:rPr>
+                <w:rFonts w:ascii="Times New Roman" w:hAnsi="Times New Roman"/>
+                <w:sz w:val="22"/>
+                <w:szCs w:val="22"/>
+              </w:rPr>
+              <w:fldChar w:fldCharType="separate"/>
+            </w:r>
+            <w:r>
+              <w:rPr>
+                <w:rFonts w:ascii="Times New Roman" w:hAnsi="Times New Roman"/>
+                <w:sz w:val="22"/>
+                <w:szCs w:val="22"/>
+              </w:rPr>
+              <w:fldChar w:fldCharType="end"/>
             </w:r>
             <w:r>
               <w:rPr>
@@ -4887,7 +5088,7 @@
                 <w:sz w:val="22"/>
                 <w:szCs w:val="22"/>
               </w:rPr>
-              <w:t xml:space="preserve">No   </w:t>
+              <w:t xml:space="preserve">Yes    </w:t>
             </w:r>
             <w:r>
               <w:rPr>
@@ -4944,142 +5145,7 @@
                 <w:sz w:val="22"/>
                 <w:szCs w:val="22"/>
               </w:rPr>
-              <w:t>N/A</w:t>
-            </w:r>
-          </w:p>
-        </w:tc>
-        <w:tc>
-          <w:tcPr>
-            <w:tcW w:w="2352" w:type="dxa"/>
-            <w:gridSpan w:val="5"/>
-            <w:shd w:val="clear" w:color="auto" w:fill="000000" w:themeFill="text1"/>
-          </w:tcPr>
-          <w:p>
-            <w:pPr>
-              <w:jc w:val="center"/>
-              <w:outlineLvl w:val="0"/>
-              <w:rPr>
-                <w:rFonts w:ascii="Times New Roman" w:hAnsi="Times New Roman"/>
-                <w:b/>
-                <w:color w:val="0D0D0D" w:themeColor="text1" w:themeTint="F2"/>
-                <w:sz w:val="22"/>
-                <w:szCs w:val="22"/>
-              </w:rPr>
-            </w:pPr>
-          </w:p>
-        </w:tc>
-        <w:tc>
-          <w:tcPr>
-            <w:tcW w:w="1800" w:type="dxa"/>
-            <w:shd w:val="clear" w:color="auto" w:fill="000000" w:themeFill="text1"/>
-          </w:tcPr>
-          <w:p>
-            <w:pPr>
-              <w:jc w:val="center"/>
-              <w:outlineLvl w:val="0"/>
-              <w:rPr>
-                <w:rFonts w:ascii="Times New Roman" w:hAnsi="Times New Roman"/>
-                <w:b/>
-                <w:color w:val="0D0D0D" w:themeColor="text1" w:themeTint="F2"/>
-                <w:sz w:val="22"/>
-                <w:szCs w:val="22"/>
-              </w:rPr>
-            </w:pPr>
-          </w:p>
-        </w:tc>
-      </w:tr>
-      <w:tr>
-        <w:trPr>
-          <w:trHeight w:val="312"/>
-        </w:trPr>
-        <w:tc>
-          <w:tcPr>
-            <w:tcW w:w="4230" w:type="dxa"/>
-            <w:gridSpan w:val="2"/>
-            <w:shd w:val="clear" w:color="auto" w:fill="FFFFFF" w:themeFill="background1"/>
-          </w:tcPr>
-          <w:p>
-            <w:pPr>
-              <w:outlineLvl w:val="0"/>
-              <w:rPr>
-                <w:rFonts w:ascii="Times New Roman" w:hAnsi="Times New Roman"/>
-                <w:sz w:val="22"/>
-                <w:szCs w:val="22"/>
-              </w:rPr>
-            </w:pPr>
-            <w:r>
-              <w:rPr>
-                <w:rFonts w:ascii="Times New Roman" w:hAnsi="Times New Roman"/>
-                <w:sz w:val="22"/>
-                <w:szCs w:val="22"/>
-              </w:rPr>
-              <w:t>Are the other test results from this run under investigation?</w:t>
-            </w:r>
-          </w:p>
-        </w:tc>
-        <w:tc>
-          <w:tcPr>
-            <w:tcW w:w="2598" w:type="dxa"/>
-            <w:gridSpan w:val="4"/>
-            <w:shd w:val="clear" w:color="auto" w:fill="FFFFFF" w:themeFill="background1"/>
-          </w:tcPr>
-          <w:p>
-            <w:pPr>
-              <w:outlineLvl w:val="0"/>
-              <w:rPr>
-                <w:rFonts w:ascii="Times New Roman" w:hAnsi="Times New Roman"/>
-                <w:sz w:val="22"/>
-                <w:szCs w:val="22"/>
-              </w:rPr>
-            </w:pPr>
-            <w:r>
-              <w:rPr>
-                <w:rFonts w:ascii="Times New Roman" w:hAnsi="Times New Roman"/>
-                <w:sz w:val="22"/>
-                <w:szCs w:val="22"/>
-              </w:rPr>
-              <w:fldChar w:fldCharType="begin">
-                <w:ffData>
-                  <w:name w:val=""/>
-                  <w:enabled/>
-                  <w:calcOnExit w:val="0"/>
-                  <w:checkBox>
-                    <w:sizeAuto/>
-                    <w:default w:val="1"/>
-                  </w:checkBox>
-                </w:ffData>
-              </w:fldChar>
-            </w:r>
-            <w:r>
-              <w:rPr>
-                <w:rFonts w:ascii="Times New Roman" w:hAnsi="Times New Roman"/>
-                <w:sz w:val="22"/>
-                <w:szCs w:val="22"/>
-              </w:rPr>
-              <w:instrText xml:space="preserve"> FORMCHECKBOX </w:instrText>
-            </w:r>
-            <w:r>
-              <w:rPr>
-                <w:rFonts w:ascii="Times New Roman" w:hAnsi="Times New Roman"/>
-                <w:sz w:val="22"/>
-                <w:szCs w:val="22"/>
-              </w:rPr>
-            </w:r>
-            <w:r>
-              <w:rPr>
-                <w:rFonts w:ascii="Times New Roman" w:hAnsi="Times New Roman"/>
-                <w:sz w:val="22"/>
-                <w:szCs w:val="22"/>
-              </w:rPr>
-              <w:fldChar w:fldCharType="separate"/>
-            </w:r>
-            <w:r>
-              <w:rPr>
-                <w:rFonts w:ascii="Times New Roman" w:hAnsi="Times New Roman"/>
-                <w:sz w:val="22"/>
-                <w:szCs w:val="22"/>
-              </w:rPr>
-              <w:fldChar w:fldCharType="end"/>
+              <w:t xml:space="preserve"> </w:t>
             </w:r>
             <w:r>
               <w:rPr>
@@ -5088,7 +5154,7 @@
                 <w:sz w:val="22"/>
                 <w:szCs w:val="22"/>
               </w:rPr>
-              <w:t xml:space="preserve">Yes    </w:t>
+              <w:t xml:space="preserve">No   </w:t>
             </w:r>
             <w:r>
               <w:rPr>
@@ -5103,73 +5169,7 @@
                   <w:calcOnExit w:val="0"/>
                   <w:checkBox>
                     <w:sizeAuto/>
-                    <w:default w:val="0"/>
-                  </w:checkBox>
-                </w:ffData>
-              </w:fldChar>
-            </w:r>
-            <w:r>
-              <w:rPr>
-                <w:rFonts w:ascii="Times New Roman" w:hAnsi="Times New Roman"/>
-                <w:sz w:val="22"/>
-                <w:szCs w:val="22"/>
-              </w:rPr>
-              <w:instrText xml:space="preserve"> FORMCHECKBOX </w:instrText>
-            </w:r>
-            <w:r>
-              <w:rPr>
-                <w:rFonts w:ascii="Times New Roman" w:hAnsi="Times New Roman"/>
-                <w:sz w:val="22"/>
-                <w:szCs w:val="22"/>
-              </w:rPr>
-            </w:r>
-            <w:r>
-              <w:rPr>
-                <w:rFonts w:ascii="Times New Roman" w:hAnsi="Times New Roman"/>
-                <w:sz w:val="22"/>
-                <w:szCs w:val="22"/>
-              </w:rPr>
-              <w:fldChar w:fldCharType="separate"/>
-            </w:r>
-            <w:r>
-              <w:rPr>
-                <w:rFonts w:ascii="Times New Roman" w:hAnsi="Times New Roman"/>
-                <w:sz w:val="22"/>
-                <w:szCs w:val="22"/>
-              </w:rPr>
-              <w:fldChar w:fldCharType="end"/>
-            </w:r>
-            <w:r>
-              <w:rPr>
-                <w:rFonts w:ascii="Times New Roman" w:hAnsi="Times New Roman"/>
-                <w:sz w:val="22"/>
-                <w:szCs w:val="22"/>
-              </w:rPr>
-              <w:t xml:space="preserve"> </w:t>
-            </w:r>
-            <w:r>
-              <w:rPr>
-                <w:rFonts w:ascii="Times New Roman" w:hAnsi="Times New Roman"/>
-                <w:noProof/>
-                <w:sz w:val="22"/>
-                <w:szCs w:val="22"/>
-              </w:rPr>
-              <w:t xml:space="preserve">No   </w:t>
-            </w:r>
-            <w:r>
-              <w:rPr>
-                <w:rFonts w:ascii="Times New Roman" w:hAnsi="Times New Roman"/>
-                <w:sz w:val="22"/>
-                <w:szCs w:val="22"/>
-              </w:rPr>
-              <w:fldChar w:fldCharType="begin">
-                <w:ffData>
-                  <w:name w:val="Check1"/>
-                  <w:enabled/>
-                  <w:calcOnExit w:val="0"/>
-                  <w:checkBox>
-                    <w:sizeAuto/>
-                    <w:default w:val="0"/>
+                    <w:default w:val="1"/>
                   </w:checkBox>
                 </w:ffData>
               </w:fldChar>

</xml_diff>

<commit_message>
feat(em): extract and populate TSA/Contact plate Lot # and Expiration Date from EM logbook
</commit_message>
<xml_diff>
--- a/EM OOS P1 template 0.docx
+++ b/EM OOS P1 template 0.docx
@@ -5741,208 +5741,9 @@
             <w:gridSpan w:val="5"/>
           </w:tcPr>
           <w:p>
-            <w:pPr>
-              <w:outlineLvl w:val="0"/>
-              <w:rPr>
-                <w:rFonts w:ascii="Times New Roman" w:hAnsi="Times New Roman"/>
-                <w:b/>
-                <w:bCs/>
-                <w:sz w:val="22"/>
-                <w:szCs w:val="22"/>
-              </w:rPr>
-            </w:pPr>
-            <w:r>
-              <w:rPr>
-                <w:rFonts w:ascii="Times New Roman" w:hAnsi="Times New Roman"/>
-                <w:b/>
-                <w:bCs/>
-                <w:sz w:val="22"/>
-                <w:szCs w:val="22"/>
-              </w:rPr>
-              <w:t>Scan Consumables:</w:t>
-            </w:r>
-          </w:p>
-          <w:p>
-            <w:pPr>
-              <w:outlineLvl w:val="0"/>
-              <w:rPr>
-                <w:rFonts w:ascii="Times New Roman" w:hAnsi="Times New Roman"/>
-                <w:sz w:val="22"/>
-                <w:szCs w:val="22"/>
-              </w:rPr>
-            </w:pPr>
-            <w:r>
-              <w:rPr>
-                <w:rFonts w:ascii="Times New Roman" w:hAnsi="Times New Roman"/>
-                <w:sz w:val="22"/>
-                <w:szCs w:val="22"/>
-              </w:rPr>
-              <w:t xml:space="preserve">See </w:t>
-            </w:r>
-            <w:r>
-              <w:rPr>
-                <w:rFonts w:ascii="Times New Roman" w:hAnsi="Times New Roman"/>
-                <w:sz w:val="22"/>
-                <w:szCs w:val="22"/>
-              </w:rPr>
-              <w:t xml:space="preserve">the </w:t>
-            </w:r>
-            <w:r>
-              <w:rPr>
-                <w:rFonts w:ascii="Times New Roman" w:hAnsi="Times New Roman"/>
-                <w:sz w:val="22"/>
-                <w:szCs w:val="22"/>
-              </w:rPr>
-              <w:t>attached data packet</w:t>
-            </w:r>
-          </w:p>
-          <w:p>
-            <w:pPr>
-              <w:outlineLvl w:val="0"/>
-              <w:rPr>
-                <w:rFonts w:ascii="Times New Roman" w:hAnsi="Times New Roman"/>
-                <w:b/>
-                <w:bCs/>
-                <w:sz w:val="22"/>
-                <w:szCs w:val="22"/>
-              </w:rPr>
-            </w:pPr>
-          </w:p>
-          <w:p>
-            <w:pPr>
-              <w:outlineLvl w:val="0"/>
-              <w:rPr>
-                <w:rFonts w:ascii="Times New Roman" w:hAnsi="Times New Roman"/>
-                <w:b/>
-                <w:bCs/>
-                <w:sz w:val="22"/>
-                <w:szCs w:val="22"/>
-              </w:rPr>
-            </w:pPr>
-          </w:p>
-          <w:p>
-            <w:pPr>
-              <w:outlineLvl w:val="0"/>
-              <w:rPr>
-                <w:rFonts w:ascii="Times New Roman" w:hAnsi="Times New Roman"/>
-                <w:b/>
-                <w:bCs/>
-                <w:sz w:val="22"/>
-                <w:szCs w:val="22"/>
-              </w:rPr>
-            </w:pPr>
-            <w:r>
-              <w:rPr>
-                <w:rFonts w:ascii="Times New Roman" w:hAnsi="Times New Roman"/>
-                <w:b/>
-                <w:bCs/>
-                <w:sz w:val="22"/>
-                <w:szCs w:val="22"/>
-              </w:rPr>
-              <w:t>Environmental Plates:</w:t>
-            </w:r>
-          </w:p>
-          <w:p>
-            <w:pPr>
-              <w:outlineLvl w:val="0"/>
-              <w:rPr>
-                <w:rFonts w:ascii="Times New Roman" w:hAnsi="Times New Roman"/>
-                <w:sz w:val="22"/>
-                <w:szCs w:val="22"/>
-              </w:rPr>
-            </w:pPr>
-            <w:r>
-              <w:rPr>
-                <w:rFonts w:ascii="Times New Roman" w:hAnsi="Times New Roman"/>
-                <w:sz w:val="22"/>
-                <w:szCs w:val="22"/>
-              </w:rPr>
-              <w:t>TSA and Surface Plate: see attached environmental logs</w:t>
-            </w:r>
-          </w:p>
-          <w:p>
-            <w:pPr>
-              <w:outlineLvl w:val="0"/>
-              <w:rPr>
-                <w:rFonts w:ascii="Times New Roman" w:hAnsi="Times New Roman"/>
-                <w:b/>
-                <w:sz w:val="22"/>
-                <w:szCs w:val="22"/>
-              </w:rPr>
-            </w:pPr>
-          </w:p>
-          <w:p>
-            <w:pPr>
-              <w:outlineLvl w:val="0"/>
-              <w:rPr>
-                <w:rFonts w:ascii="Times New Roman" w:hAnsi="Times New Roman"/>
-                <w:b/>
-                <w:bCs/>
-                <w:sz w:val="22"/>
-                <w:szCs w:val="22"/>
-              </w:rPr>
-            </w:pPr>
-          </w:p>
-          <w:p>
-            <w:pPr>
-              <w:outlineLvl w:val="0"/>
-              <w:rPr>
-                <w:rFonts w:ascii="Times New Roman" w:hAnsi="Times New Roman"/>
-                <w:sz w:val="22"/>
-                <w:szCs w:val="22"/>
-              </w:rPr>
-            </w:pPr>
-            <w:r>
-              <w:rPr>
-                <w:rFonts w:ascii="Times New Roman" w:hAnsi="Times New Roman"/>
-                <w:b/>
-                <w:bCs/>
-                <w:sz w:val="22"/>
-                <w:szCs w:val="22"/>
-              </w:rPr>
-              <w:t>Monthly Cleaning:</w:t>
-            </w:r>
-          </w:p>
-          <w:p>
-            <w:pPr>
-              <w:outlineLvl w:val="0"/>
-              <w:rPr>
-                <w:rFonts w:ascii="Times New Roman" w:hAnsi="Times New Roman"/>
-                <w:bCs/>
-                <w:sz w:val="22"/>
-                <w:szCs w:val="22"/>
-              </w:rPr>
-            </w:pPr>
-            <w:r>
-              <w:rPr>
-                <w:rFonts w:ascii="Times New Roman" w:hAnsi="Times New Roman"/>
-                <w:b/>
-                <w:sz w:val="22"/>
-                <w:szCs w:val="22"/>
-              </w:rPr>
-              <w:t>H2O2 strips and IPA:</w:t>
-            </w:r>
-            <w:r>
-              <w:rPr>
-                <w:rFonts w:ascii="Times New Roman" w:hAnsi="Times New Roman"/>
-                <w:bCs/>
-                <w:sz w:val="22"/>
-                <w:szCs w:val="22"/>
-              </w:rPr>
-              <w:t xml:space="preserve"> See attached monthly cleaning logs</w:t>
-            </w:r>
-          </w:p>
-          <w:p>
-            <w:pPr>
-              <w:outlineLvl w:val="0"/>
-              <w:rPr>
-                <w:rFonts w:ascii="Times New Roman" w:hAnsi="Times New Roman"/>
-                <w:bCs/>
-                <w:sz w:val="22"/>
-                <w:szCs w:val="22"/>
-                <w:highlight w:val="yellow"/>
-              </w:rPr>
-            </w:pPr>
+            <w:r>
+              <w:t>{{ reagent_lot }}</w:t>
+            </w:r>
           </w:p>
         </w:tc>
         <w:tc>
@@ -5950,165 +5751,9 @@
             <w:tcW w:w="1800" w:type="dxa"/>
           </w:tcPr>
           <w:p>
-            <w:pPr>
-              <w:outlineLvl w:val="0"/>
-              <w:rPr>
-                <w:rFonts w:ascii="Times New Roman" w:hAnsi="Times New Roman"/>
-                <w:b/>
-                <w:bCs/>
-                <w:sz w:val="22"/>
-                <w:szCs w:val="22"/>
-              </w:rPr>
-            </w:pPr>
-            <w:r>
-              <w:rPr>
-                <w:rFonts w:ascii="Times New Roman" w:hAnsi="Times New Roman"/>
-                <w:b/>
-                <w:bCs/>
-                <w:sz w:val="22"/>
-                <w:szCs w:val="22"/>
-              </w:rPr>
-              <w:t>Scan Consumables:</w:t>
-            </w:r>
-          </w:p>
-          <w:p>
-            <w:pPr>
-              <w:outlineLvl w:val="0"/>
-              <w:rPr>
-                <w:rFonts w:ascii="Times New Roman" w:hAnsi="Times New Roman"/>
-                <w:sz w:val="22"/>
-                <w:szCs w:val="22"/>
-              </w:rPr>
-            </w:pPr>
-            <w:r>
-              <w:rPr>
-                <w:rFonts w:ascii="Times New Roman" w:hAnsi="Times New Roman"/>
-                <w:sz w:val="22"/>
-                <w:szCs w:val="22"/>
-              </w:rPr>
-              <w:t>See attached data packet</w:t>
-            </w:r>
-          </w:p>
-          <w:p>
-            <w:pPr>
-              <w:outlineLvl w:val="0"/>
-              <w:rPr>
-                <w:rFonts w:ascii="Times New Roman" w:hAnsi="Times New Roman"/>
-                <w:sz w:val="22"/>
-                <w:szCs w:val="22"/>
-              </w:rPr>
-            </w:pPr>
-          </w:p>
-          <w:p>
-            <w:pPr>
-              <w:outlineLvl w:val="0"/>
-              <w:rPr>
-                <w:rFonts w:ascii="Times New Roman" w:hAnsi="Times New Roman"/>
-                <w:b/>
-                <w:bCs/>
-                <w:sz w:val="22"/>
-                <w:szCs w:val="22"/>
-              </w:rPr>
-            </w:pPr>
-            <w:r>
-              <w:rPr>
-                <w:rFonts w:ascii="Times New Roman" w:hAnsi="Times New Roman"/>
-                <w:b/>
-                <w:bCs/>
-                <w:sz w:val="22"/>
-                <w:szCs w:val="22"/>
-              </w:rPr>
-              <w:t>Environmental Plates:</w:t>
-            </w:r>
-          </w:p>
-          <w:p>
-            <w:pPr>
-              <w:outlineLvl w:val="0"/>
-              <w:rPr>
-                <w:rFonts w:ascii="Times New Roman" w:hAnsi="Times New Roman"/>
-                <w:sz w:val="22"/>
-                <w:szCs w:val="22"/>
-              </w:rPr>
-            </w:pPr>
-            <w:r>
-              <w:rPr>
-                <w:rFonts w:ascii="Times New Roman" w:hAnsi="Times New Roman"/>
-                <w:sz w:val="22"/>
-                <w:szCs w:val="22"/>
-              </w:rPr>
-              <w:t>TSA and Surface Plate: see attached environmental logs</w:t>
-            </w:r>
-          </w:p>
-          <w:p>
-            <w:pPr>
-              <w:outlineLvl w:val="0"/>
-              <w:rPr>
-                <w:rFonts w:ascii="Times New Roman" w:hAnsi="Times New Roman"/>
-                <w:sz w:val="22"/>
-                <w:szCs w:val="22"/>
-              </w:rPr>
-            </w:pPr>
-          </w:p>
-          <w:p>
-            <w:pPr>
-              <w:outlineLvl w:val="0"/>
-              <w:rPr>
-                <w:rFonts w:ascii="Times New Roman" w:hAnsi="Times New Roman"/>
-                <w:sz w:val="22"/>
-                <w:szCs w:val="22"/>
-              </w:rPr>
-            </w:pPr>
-            <w:r>
-              <w:rPr>
-                <w:rFonts w:ascii="Times New Roman" w:hAnsi="Times New Roman"/>
-                <w:b/>
-                <w:bCs/>
-                <w:sz w:val="22"/>
-                <w:szCs w:val="22"/>
-              </w:rPr>
-              <w:t>Monthly Cleaning:</w:t>
-            </w:r>
-          </w:p>
-          <w:p>
-            <w:pPr>
-              <w:outlineLvl w:val="0"/>
-              <w:rPr>
-                <w:rFonts w:ascii="Times New Roman" w:hAnsi="Times New Roman"/>
-                <w:bCs/>
-                <w:sz w:val="22"/>
-                <w:szCs w:val="22"/>
-              </w:rPr>
-            </w:pPr>
-            <w:r>
-              <w:rPr>
-                <w:rFonts w:ascii="Times New Roman" w:hAnsi="Times New Roman"/>
-                <w:b/>
-                <w:sz w:val="22"/>
-                <w:szCs w:val="22"/>
-              </w:rPr>
-              <w:t>H2O2 strips and IPA:</w:t>
-            </w:r>
-            <w:r>
-              <w:rPr>
-                <w:rFonts w:ascii="Times New Roman" w:hAnsi="Times New Roman"/>
-                <w:bCs/>
-                <w:sz w:val="22"/>
-                <w:szCs w:val="22"/>
-              </w:rPr>
-              <w:t xml:space="preserve"> See attached monthly cleaning logs</w:t>
-            </w:r>
-          </w:p>
-          <w:p>
-            <w:pPr>
-              <w:outlineLvl w:val="0"/>
-              <w:rPr>
-                <w:rFonts w:ascii="Times New Roman" w:hAnsi="Times New Roman"/>
-                <w:bCs/>
-                <w:sz w:val="22"/>
-                <w:szCs w:val="22"/>
-                <w:highlight w:val="yellow"/>
-              </w:rPr>
-            </w:pPr>
+            <w:r>
+              <w:t>{{ reagent_exp }}</w:t>
+            </w:r>
           </w:p>
         </w:tc>
       </w:tr>

</xml_diff>

<commit_message>
feat(em): auto-populate cleanroom ID CR116 ( E001738 ) and cert date December 2026
</commit_message>
<xml_diff>
--- a/EM OOS P1 template 0.docx
+++ b/EM OOS P1 template 0.docx
@@ -6934,32 +6934,8 @@
             <w:shd w:val="clear" w:color="auto" w:fill="FFFFFF" w:themeFill="background1"/>
           </w:tcPr>
           <w:p>
-            <w:pPr>
-              <w:jc w:val="center"/>
-              <w:outlineLvl w:val="0"/>
-              <w:rPr>
-                <w:rFonts w:ascii="Times New Roman" w:hAnsi="Times New Roman"/>
-                <w:b/>
-                <w:sz w:val="22"/>
-                <w:szCs w:val="22"/>
-                <w:highlight w:val="yellow"/>
-              </w:rPr>
-            </w:pPr>
-            <w:r>
-              <w:rPr>
-                <w:rFonts w:ascii="Times New Roman" w:hAnsi="Times New Roman"/>
-                <w:sz w:val="22"/>
-                <w:szCs w:val="22"/>
-              </w:rPr>
-              <w:t>E00</w:t>
-            </w:r>
-            <w:r>
-              <w:rPr>
-                <w:rFonts w:ascii="Times New Roman" w:hAnsi="Times New Roman"/>
-                <w:sz w:val="22"/>
-                <w:szCs w:val="22"/>
-              </w:rPr>
-              <w:t>{{ scan_id }}</w:t>
+            <w:r>
+              <w:t>Please see below</w:t>
             </w:r>
           </w:p>
         </w:tc>
@@ -6969,23 +6945,8 @@
             <w:shd w:val="clear" w:color="auto" w:fill="FFFFFF" w:themeFill="background1"/>
           </w:tcPr>
           <w:p>
-            <w:pPr>
-              <w:jc w:val="center"/>
-              <w:outlineLvl w:val="0"/>
-              <w:rPr>
-                <w:rFonts w:ascii="Times New Roman" w:hAnsi="Times New Roman"/>
-                <w:b/>
-                <w:sz w:val="22"/>
-                <w:szCs w:val="22"/>
-              </w:rPr>
-            </w:pPr>
-            <w:r>
-              <w:rPr>
-                <w:rFonts w:ascii="Times New Roman" w:hAnsi="Times New Roman"/>
-                <w:sz w:val="22"/>
-                <w:szCs w:val="22"/>
-              </w:rPr>
-              <w:t>Oct26</w:t>
+            <w:r>
+              <w:t>Please see below</w:t>
             </w:r>
           </w:p>
         </w:tc>
@@ -7224,24 +7185,8 @@
             <w:shd w:val="clear" w:color="auto" w:fill="FFFFFF" w:themeFill="background1"/>
           </w:tcPr>
           <w:p>
-            <w:pPr>
-              <w:jc w:val="center"/>
-              <w:outlineLvl w:val="0"/>
-              <w:rPr>
-                <w:rFonts w:ascii="Times New Roman" w:eastAsiaTheme="minorEastAsia" w:hAnsi="Times New Roman"/>
-                <w:sz w:val="22"/>
-                <w:szCs w:val="22"/>
-                <w:highlight w:val="yellow"/>
-                <w:lang w:eastAsia="zh-CN"/>
-              </w:rPr>
-            </w:pPr>
-            <w:r>
-              <w:rPr>
-                <w:rFonts w:ascii="Times New Roman" w:hAnsi="Times New Roman"/>
-                <w:sz w:val="22"/>
-                <w:szCs w:val="22"/>
-              </w:rPr>
-              <w:t>E00{{ cr_id }} (CR{{ cr_suit }})</w:t>
+            <w:r>
+              <w:t>{{ cr_display }}</w:t>
             </w:r>
           </w:p>
         </w:tc>
@@ -7251,30 +7196,8 @@
             <w:shd w:val="clear" w:color="auto" w:fill="FFFFFF" w:themeFill="background1"/>
           </w:tcPr>
           <w:p>
-            <w:pPr>
-              <w:jc w:val="center"/>
-              <w:outlineLvl w:val="0"/>
-              <w:rPr>
-                <w:rFonts w:ascii="Times New Roman" w:hAnsi="Times New Roman"/>
-                <w:sz w:val="22"/>
-                <w:szCs w:val="22"/>
-              </w:rPr>
-            </w:pPr>
-            <w:r>
-              <w:rPr>
-                <w:rFonts w:ascii="Times New Roman" w:hAnsi="Times New Roman"/>
-                <w:sz w:val="22"/>
-                <w:szCs w:val="22"/>
-              </w:rPr>
-              <w:t>Dec2</w:t>
-            </w:r>
-            <w:r>
-              <w:rPr>
-                <w:rFonts w:ascii="Times New Roman" w:hAnsi="Times New Roman"/>
-                <w:sz w:val="22"/>
-                <w:szCs w:val="22"/>
-              </w:rPr>
-              <w:t>5</w:t>
+            <w:r>
+              <w:t>{{ cr_exp }}</w:t>
             </w:r>
           </w:p>
         </w:tc>
@@ -7323,6 +7246,130 @@
                 <w:szCs w:val="22"/>
               </w:rPr>
             </w:pPr>
+            <w:r>
+              <w:rPr>
+                <w:rFonts w:ascii="Times New Roman" w:hAnsi="Times New Roman"/>
+                <w:sz w:val="22"/>
+                <w:szCs w:val="22"/>
+              </w:rPr>
+              <w:fldChar w:fldCharType="begin">
+                <w:ffData>
+                  <w:name w:val=""/>
+                  <w:enabled/>
+                  <w:calcOnExit w:val="0"/>
+                  <w:checkBox>
+                    <w:sizeAuto/>
+                    <w:default w:val="0"/>
+                  </w:checkBox>
+                </w:ffData>
+              </w:fldChar>
+            </w:r>
+            <w:r>
+              <w:rPr>
+                <w:rFonts w:ascii="Times New Roman" w:hAnsi="Times New Roman"/>
+                <w:sz w:val="22"/>
+                <w:szCs w:val="22"/>
+              </w:rPr>
+              <w:instrText xml:space="preserve"> FORMCHECKBOX </w:instrText>
+            </w:r>
+            <w:r>
+              <w:rPr>
+                <w:rFonts w:ascii="Times New Roman" w:hAnsi="Times New Roman"/>
+                <w:sz w:val="22"/>
+                <w:szCs w:val="22"/>
+              </w:rPr>
+            </w:r>
+            <w:r>
+              <w:rPr>
+                <w:rFonts w:ascii="Times New Roman" w:hAnsi="Times New Roman"/>
+                <w:sz w:val="22"/>
+                <w:szCs w:val="22"/>
+              </w:rPr>
+              <w:fldChar w:fldCharType="separate"/>
+            </w:r>
+            <w:r>
+              <w:rPr>
+                <w:rFonts w:ascii="Times New Roman" w:hAnsi="Times New Roman"/>
+                <w:sz w:val="22"/>
+                <w:szCs w:val="22"/>
+              </w:rPr>
+              <w:fldChar w:fldCharType="end"/>
+            </w:r>
+            <w:r>
+              <w:rPr>
+                <w:rFonts w:ascii="Times New Roman" w:hAnsi="Times New Roman"/>
+                <w:noProof/>
+                <w:sz w:val="22"/>
+                <w:szCs w:val="22"/>
+              </w:rPr>
+              <w:t xml:space="preserve">Yes    </w:t>
+            </w:r>
+            <w:r>
+              <w:rPr>
+                <w:rFonts w:ascii="Times New Roman" w:hAnsi="Times New Roman"/>
+                <w:sz w:val="22"/>
+                <w:szCs w:val="22"/>
+              </w:rPr>
+              <w:fldChar w:fldCharType="begin">
+                <w:ffData>
+                  <w:name w:val=""/>
+                  <w:enabled/>
+                  <w:calcOnExit w:val="0"/>
+                  <w:checkBox>
+                    <w:sizeAuto/>
+                    <w:default w:val="0"/>
+                  </w:checkBox>
+                </w:ffData>
+              </w:fldChar>
+            </w:r>
+            <w:r>
+              <w:rPr>
+                <w:rFonts w:ascii="Times New Roman" w:hAnsi="Times New Roman"/>
+                <w:sz w:val="22"/>
+                <w:szCs w:val="22"/>
+              </w:rPr>
+              <w:instrText xml:space="preserve"> FORMCHECKBOX </w:instrText>
+            </w:r>
+            <w:r>
+              <w:rPr>
+                <w:rFonts w:ascii="Times New Roman" w:hAnsi="Times New Roman"/>
+                <w:sz w:val="22"/>
+                <w:szCs w:val="22"/>
+              </w:rPr>
+            </w:r>
+            <w:r>
+              <w:rPr>
+                <w:rFonts w:ascii="Times New Roman" w:hAnsi="Times New Roman"/>
+                <w:sz w:val="22"/>
+                <w:szCs w:val="22"/>
+              </w:rPr>
+              <w:fldChar w:fldCharType="separate"/>
+            </w:r>
+            <w:r>
+              <w:rPr>
+                <w:rFonts w:ascii="Times New Roman" w:hAnsi="Times New Roman"/>
+                <w:sz w:val="22"/>
+                <w:szCs w:val="22"/>
+              </w:rPr>
+              <w:fldChar w:fldCharType="end"/>
+            </w:r>
+            <w:r>
+              <w:rPr>
+                <w:rFonts w:ascii="Times New Roman" w:hAnsi="Times New Roman"/>
+                <w:sz w:val="22"/>
+                <w:szCs w:val="22"/>
+              </w:rPr>
+              <w:t xml:space="preserve"> </w:t>
+            </w:r>
+            <w:r>
+              <w:rPr>
+                <w:rFonts w:ascii="Times New Roman" w:hAnsi="Times New Roman"/>
+                <w:noProof/>
+                <w:sz w:val="22"/>
+                <w:szCs w:val="22"/>
+              </w:rPr>
+              <w:t xml:space="preserve">No   </w:t>
+            </w:r>
             <w:r>
               <w:rPr>
                 <w:rFonts w:ascii="Times New Roman" w:hAnsi="Times New Roman"/>
@@ -7375,130 +7422,6 @@
             <w:r>
               <w:rPr>
                 <w:rFonts w:ascii="Times New Roman" w:hAnsi="Times New Roman"/>
-                <w:noProof/>
-                <w:sz w:val="22"/>
-                <w:szCs w:val="22"/>
-              </w:rPr>
-              <w:t xml:space="preserve">Yes    </w:t>
-            </w:r>
-            <w:r>
-              <w:rPr>
-                <w:rFonts w:ascii="Times New Roman" w:hAnsi="Times New Roman"/>
-                <w:sz w:val="22"/>
-                <w:szCs w:val="22"/>
-              </w:rPr>
-              <w:fldChar w:fldCharType="begin">
-                <w:ffData>
-                  <w:name w:val=""/>
-                  <w:enabled/>
-                  <w:calcOnExit w:val="0"/>
-                  <w:checkBox>
-                    <w:sizeAuto/>
-                    <w:default w:val="0"/>
-                  </w:checkBox>
-                </w:ffData>
-              </w:fldChar>
-            </w:r>
-            <w:r>
-              <w:rPr>
-                <w:rFonts w:ascii="Times New Roman" w:hAnsi="Times New Roman"/>
-                <w:sz w:val="22"/>
-                <w:szCs w:val="22"/>
-              </w:rPr>
-              <w:instrText xml:space="preserve"> FORMCHECKBOX </w:instrText>
-            </w:r>
-            <w:r>
-              <w:rPr>
-                <w:rFonts w:ascii="Times New Roman" w:hAnsi="Times New Roman"/>
-                <w:sz w:val="22"/>
-                <w:szCs w:val="22"/>
-              </w:rPr>
-            </w:r>
-            <w:r>
-              <w:rPr>
-                <w:rFonts w:ascii="Times New Roman" w:hAnsi="Times New Roman"/>
-                <w:sz w:val="22"/>
-                <w:szCs w:val="22"/>
-              </w:rPr>
-              <w:fldChar w:fldCharType="separate"/>
-            </w:r>
-            <w:r>
-              <w:rPr>
-                <w:rFonts w:ascii="Times New Roman" w:hAnsi="Times New Roman"/>
-                <w:sz w:val="22"/>
-                <w:szCs w:val="22"/>
-              </w:rPr>
-              <w:fldChar w:fldCharType="end"/>
-            </w:r>
-            <w:r>
-              <w:rPr>
-                <w:rFonts w:ascii="Times New Roman" w:hAnsi="Times New Roman"/>
-                <w:sz w:val="22"/>
-                <w:szCs w:val="22"/>
-              </w:rPr>
-              <w:t xml:space="preserve"> </w:t>
-            </w:r>
-            <w:r>
-              <w:rPr>
-                <w:rFonts w:ascii="Times New Roman" w:hAnsi="Times New Roman"/>
-                <w:noProof/>
-                <w:sz w:val="22"/>
-                <w:szCs w:val="22"/>
-              </w:rPr>
-              <w:t xml:space="preserve">No   </w:t>
-            </w:r>
-            <w:r>
-              <w:rPr>
-                <w:rFonts w:ascii="Times New Roman" w:hAnsi="Times New Roman"/>
-                <w:sz w:val="22"/>
-                <w:szCs w:val="22"/>
-              </w:rPr>
-              <w:fldChar w:fldCharType="begin">
-                <w:ffData>
-                  <w:name w:val=""/>
-                  <w:enabled/>
-                  <w:calcOnExit w:val="0"/>
-                  <w:checkBox>
-                    <w:sizeAuto/>
-                    <w:default w:val="0"/>
-                  </w:checkBox>
-                </w:ffData>
-              </w:fldChar>
-            </w:r>
-            <w:r>
-              <w:rPr>
-                <w:rFonts w:ascii="Times New Roman" w:hAnsi="Times New Roman"/>
-                <w:sz w:val="22"/>
-                <w:szCs w:val="22"/>
-              </w:rPr>
-              <w:instrText xml:space="preserve"> FORMCHECKBOX </w:instrText>
-            </w:r>
-            <w:r>
-              <w:rPr>
-                <w:rFonts w:ascii="Times New Roman" w:hAnsi="Times New Roman"/>
-                <w:sz w:val="22"/>
-                <w:szCs w:val="22"/>
-              </w:rPr>
-            </w:r>
-            <w:r>
-              <w:rPr>
-                <w:rFonts w:ascii="Times New Roman" w:hAnsi="Times New Roman"/>
-                <w:sz w:val="22"/>
-                <w:szCs w:val="22"/>
-              </w:rPr>
-              <w:fldChar w:fldCharType="separate"/>
-            </w:r>
-            <w:r>
-              <w:rPr>
-                <w:rFonts w:ascii="Times New Roman" w:hAnsi="Times New Roman"/>
-                <w:sz w:val="22"/>
-                <w:szCs w:val="22"/>
-              </w:rPr>
-              <w:fldChar w:fldCharType="end"/>
-            </w:r>
-            <w:r>
-              <w:rPr>
-                <w:rFonts w:ascii="Times New Roman" w:hAnsi="Times New Roman"/>
                 <w:sz w:val="22"/>
                 <w:szCs w:val="22"/>
               </w:rPr>
@@ -7513,31 +7436,8 @@
             <w:shd w:val="clear" w:color="auto" w:fill="FFFFFF" w:themeFill="background1"/>
           </w:tcPr>
           <w:p>
-            <w:pPr>
-              <w:jc w:val="center"/>
-              <w:outlineLvl w:val="0"/>
-              <w:rPr>
-                <w:rFonts w:ascii="Times New Roman" w:hAnsi="Times New Roman"/>
-                <w:sz w:val="22"/>
-                <w:szCs w:val="22"/>
-                <w:highlight w:val="yellow"/>
-              </w:rPr>
-            </w:pPr>
-            <w:r>
-              <w:rPr>
-                <w:rFonts w:ascii="Times New Roman" w:hAnsi="Times New Roman"/>
-                <w:sz w:val="22"/>
-                <w:szCs w:val="22"/>
-              </w:rPr>
-              <w:t>E00</w:t>
-            </w:r>
-            <w:r>
-              <w:rPr>
-                <w:rFonts w:ascii="Times New Roman" w:hAnsi="Times New Roman"/>
-                <w:sz w:val="22"/>
-                <w:szCs w:val="22"/>
-              </w:rPr>
-              <w:t>{{ scan_id }}</w:t>
+            <w:r>
+              <w:t>N/A</w:t>
             </w:r>
           </w:p>
         </w:tc>
@@ -7547,22 +7447,8 @@
             <w:shd w:val="clear" w:color="auto" w:fill="FFFFFF" w:themeFill="background1"/>
           </w:tcPr>
           <w:p>
-            <w:pPr>
-              <w:jc w:val="center"/>
-              <w:outlineLvl w:val="0"/>
-              <w:rPr>
-                <w:rFonts w:ascii="Times New Roman" w:hAnsi="Times New Roman"/>
-                <w:sz w:val="22"/>
-                <w:szCs w:val="22"/>
-              </w:rPr>
-            </w:pPr>
-            <w:r>
-              <w:rPr>
-                <w:rFonts w:ascii="Times New Roman" w:hAnsi="Times New Roman"/>
-                <w:sz w:val="22"/>
-                <w:szCs w:val="22"/>
-              </w:rPr>
-              <w:t>Oct26</w:t>
+            <w:r>
+              <w:t>N/A</w:t>
             </w:r>
           </w:p>
         </w:tc>

</xml_diff>

<commit_message>
feat(em): align EM templates and logic engine with supervisor RS reviewed gold standard
</commit_message>
<xml_diff>
--- a/EM OOS P1 template 0.docx
+++ b/EM OOS P1 template 0.docx
@@ -1611,9 +1611,7 @@
             <w:r>
               <w:t>SOP / Test Method #:</w:t>
               <w:br/>
-              <w:t>2.600.002 (10)</w:t>
-              <w:br/>
-              <w:t>2.700.004 (03)</w:t>
+              <w:t>MICRO-SOP-2</w:t>
               <w:br/>
             </w:r>
           </w:p>
@@ -1624,63 +1622,11 @@
             <w:gridSpan w:val="5"/>
           </w:tcPr>
           <w:p>
-            <w:pPr>
-              <w:outlineLvl w:val="0"/>
-              <w:rPr>
-                <w:rFonts w:ascii="Times New Roman" w:hAnsi="Times New Roman"/>
-                <w:bCs/>
-                <w:sz w:val="22"/>
-                <w:szCs w:val="22"/>
-              </w:rPr>
-            </w:pPr>
-            <w:r>
-              <w:rPr>
-                <w:rFonts w:ascii="Times New Roman" w:hAnsi="Times New Roman"/>
-                <w:bCs/>
-                <w:sz w:val="22"/>
-                <w:szCs w:val="22"/>
-              </w:rPr>
-              <w:t xml:space="preserve">Effective Date: </w:t>
-            </w:r>
-          </w:p>
-          <w:p>
-            <w:pPr>
-              <w:outlineLvl w:val="0"/>
-              <w:rPr>
-                <w:rFonts w:ascii="Times New Roman" w:hAnsi="Times New Roman"/>
-                <w:bCs/>
-                <w:sz w:val="22"/>
-                <w:szCs w:val="22"/>
-              </w:rPr>
-            </w:pPr>
-            <w:r>
-              <w:rPr>
-                <w:rFonts w:ascii="Times New Roman" w:hAnsi="Times New Roman"/>
-                <w:bCs/>
-                <w:sz w:val="22"/>
-                <w:szCs w:val="22"/>
-              </w:rPr>
-              <w:t>07Apr25</w:t>
-            </w:r>
-          </w:p>
-          <w:p>
-            <w:pPr>
-              <w:outlineLvl w:val="0"/>
-              <w:rPr>
-                <w:rFonts w:ascii="Times New Roman" w:hAnsi="Times New Roman"/>
-                <w:bCs/>
-                <w:sz w:val="22"/>
-                <w:szCs w:val="22"/>
-              </w:rPr>
-            </w:pPr>
-            <w:r>
-              <w:rPr>
-                <w:rFonts w:ascii="Times New Roman" w:hAnsi="Times New Roman"/>
-                <w:bCs/>
-                <w:sz w:val="22"/>
-                <w:szCs w:val="22"/>
-              </w:rPr>
-              <w:t>02Jan23</w:t>
+            <w:r>
+              <w:t>Effective Date:</w:t>
+              <w:br/>
+              <w:t>05 Aug 2025</w:t>
+              <w:br/>
             </w:r>
           </w:p>
         </w:tc>
@@ -1690,67 +1636,11 @@
             <w:gridSpan w:val="2"/>
           </w:tcPr>
           <w:p>
-            <w:pPr>
-              <w:outlineLvl w:val="0"/>
-              <w:rPr>
-                <w:rFonts w:ascii="Times New Roman" w:hAnsi="Times New Roman"/>
-                <w:bCs/>
-                <w:noProof/>
-                <w:sz w:val="22"/>
-                <w:szCs w:val="22"/>
-              </w:rPr>
-            </w:pPr>
-            <w:r>
-              <w:rPr>
-                <w:rFonts w:ascii="Times New Roman" w:hAnsi="Times New Roman"/>
-                <w:bCs/>
-                <w:noProof/>
-                <w:sz w:val="22"/>
-                <w:szCs w:val="22"/>
-              </w:rPr>
-              <w:t xml:space="preserve">SOP / Test Method Rev: </w:t>
-            </w:r>
-            <w:r>
-              <w:rPr>
-                <w:rFonts w:ascii="Times New Roman" w:hAnsi="Times New Roman"/>
-                <w:bCs/>
-                <w:noProof/>
-                <w:sz w:val="22"/>
-                <w:szCs w:val="22"/>
-              </w:rPr>
-              <w:t>10</w:t>
-            </w:r>
-          </w:p>
-          <w:p>
-            <w:pPr>
-              <w:outlineLvl w:val="0"/>
-              <w:rPr>
-                <w:rFonts w:ascii="Times New Roman" w:hAnsi="Times New Roman"/>
-                <w:bCs/>
-                <w:noProof/>
-                <w:sz w:val="22"/>
-                <w:szCs w:val="22"/>
-              </w:rPr>
-            </w:pPr>
-            <w:r>
-              <w:rPr>
-                <w:rFonts w:ascii="Times New Roman" w:hAnsi="Times New Roman"/>
-                <w:bCs/>
-                <w:noProof/>
-                <w:sz w:val="22"/>
-                <w:szCs w:val="22"/>
-              </w:rPr>
-              <w:t>Rev: 0</w:t>
-            </w:r>
-            <w:r>
-              <w:rPr>
-                <w:rFonts w:ascii="Times New Roman" w:hAnsi="Times New Roman"/>
-                <w:bCs/>
-                <w:noProof/>
-                <w:sz w:val="22"/>
-                <w:szCs w:val="22"/>
-              </w:rPr>
-              <w:t>3</w:t>
+            <w:r>
+              <w:t>SOP / Test Method Rev:</w:t>
+              <w:br/>
+              <w:t>15</w:t>
+              <w:br/>
             </w:r>
           </w:p>
         </w:tc>
@@ -3039,7 +2929,7 @@
           </w:tcPr>
           <w:p>
             <w:r>
-              <w:t>Yes, as per SOP 2.600.002, 2.700.004</w:t>
+              <w:t>Yes, as per MICRO-SOP-2</w:t>
             </w:r>
           </w:p>
         </w:tc>
@@ -3280,7 +3170,7 @@
           </w:tcPr>
           <w:p>
             <w:r>
-              <w:t>Yes, as per SOP 2.600.002, 2.700.004</w:t>
+              <w:t>Yes, as per MICRO-SOP-2</w:t>
             </w:r>
           </w:p>
         </w:tc>
@@ -3823,39 +3713,8 @@
             <w:shd w:val="clear" w:color="auto" w:fill="FFFFFF" w:themeFill="background1"/>
           </w:tcPr>
           <w:p>
-            <w:pPr>
-              <w:jc w:val="center"/>
-              <w:outlineLvl w:val="0"/>
-              <w:rPr>
-                <w:rFonts w:ascii="Times New Roman" w:hAnsi="Times New Roman"/>
-                <w:b/>
-                <w:sz w:val="22"/>
-                <w:szCs w:val="22"/>
-              </w:rPr>
-            </w:pPr>
-            <w:r>
-              <w:rPr>
-                <w:rFonts w:ascii="Times New Roman" w:hAnsi="Times New Roman"/>
-                <w:sz w:val="22"/>
-                <w:szCs w:val="22"/>
-              </w:rPr>
-              <w:t xml:space="preserve">Yes, </w:t>
-            </w:r>
-            <w:r>
-              <w:rPr>
-                <w:rFonts w:ascii="Times New Roman" w:hAnsi="Times New Roman"/>
-                <w:sz w:val="22"/>
-                <w:szCs w:val="22"/>
-              </w:rPr>
-              <w:t>all</w:t>
-            </w:r>
-            <w:r>
-              <w:rPr>
-                <w:rFonts w:ascii="Times New Roman" w:hAnsi="Times New Roman"/>
-                <w:sz w:val="22"/>
-                <w:szCs w:val="22"/>
-              </w:rPr>
-              <w:t xml:space="preserve"> analysts are trained and qualified by quality to perform the test.</w:t>
+            <w:r>
+              <w:t>Yes, the analysts are trained and qualified by quality to perform the test</w:t>
             </w:r>
           </w:p>
         </w:tc>
@@ -4604,31 +4463,8 @@
             <w:shd w:val="clear" w:color="auto" w:fill="FFFFFF" w:themeFill="background1"/>
           </w:tcPr>
           <w:p>
-            <w:pPr>
-              <w:jc w:val="center"/>
-              <w:outlineLvl w:val="0"/>
-              <w:rPr>
-                <w:rFonts w:ascii="Times New Roman" w:hAnsi="Times New Roman"/>
-                <w:sz w:val="22"/>
-                <w:szCs w:val="22"/>
-              </w:rPr>
-            </w:pPr>
-            <w:r>
-              <w:rPr>
-                <w:rFonts w:ascii="Times New Roman" w:hAnsi="Times New Roman"/>
-                <w:sz w:val="22"/>
-                <w:szCs w:val="22"/>
-              </w:rPr>
-              <w:t xml:space="preserve">Yes, Information is available in Eagle Trax Sample Location History under </w:t>
-            </w:r>
-            <w:r>
-              <w:rPr>
-                <w:rFonts w:ascii="Times New Roman" w:hAnsi="Times New Roman"/>
-                <w:bCs/>
-                <w:sz w:val="22"/>
-                <w:szCs w:val="22"/>
-              </w:rPr>
-              <w:t>{{ sample_id }}</w:t>
+            <w:r>
+              <w:t>Yes, as per MICRO-SOP-2</w:t>
             </w:r>
           </w:p>
         </w:tc>

</xml_diff>

<commit_message>
fix(em): update default MICRO-SOP-2 to Rev 16 and effective date 23-Jul-2026
</commit_message>
<xml_diff>
--- a/EM OOS P1 template 0.docx
+++ b/EM OOS P1 template 0.docx
@@ -1625,7 +1625,7 @@
             <w:r>
               <w:t>Effective Date:</w:t>
               <w:br/>
-              <w:t>05 Aug 2025</w:t>
+              <w:t>23-Jul-2026</w:t>
               <w:br/>
             </w:r>
           </w:p>
@@ -1639,7 +1639,7 @@
             <w:r>
               <w:t>SOP / Test Method Rev:</w:t>
               <w:br/>
-              <w:t>15</w:t>
+              <w:t>16</w:t>
               <w:br/>
             </w:r>
           </w:p>

</xml_diff>